<commit_message>
Set DMP as data owner in appendix A
Co-Authored-By: Claude Sonnet 5.5 <noreply@anthropic.com>
Claude-Session: https://claude.ai/code/session_01EyXn3PHR4UyVefB9g7RrZa
</commit_message>
<xml_diff>
--- a/Draft_Arah_Strategis_GloRI_QS_WUR.docx
+++ b/Draft_Arah_Strategis_GloRI_QS_WUR.docx
@@ -21383,7 +21383,7 @@
               <w:rPr>
                 <w:sz w:val="16"/>
               </w:rPr>
-              <w:t xml:space="preserve">Baseline U1 sampai U4</w:t>
+              <w:t xml:space="preserve">Baseline U1 sampai U4, U7</w:t>
             </w:r>
           </w:p>
         </w:tc>
@@ -21413,7 +21413,7 @@
               <w:rPr>
                 <w:sz w:val="16"/>
               </w:rPr>
-              <w:t xml:space="preserve">Perpustakaan</w:t>
+              <w:t xml:space="preserve">DMP</w:t>
             </w:r>
           </w:p>
         </w:tc>

</xml_diff>

<commit_message>
Record DMP as former PMC upgraded to directorate in 2026
Co-Authored-By: Claude Sonnet 5.5 <noreply@anthropic.com>
Claude-Session: https://claude.ai/code/session_01EyXn3PHR4UyVefB9g7RrZa
</commit_message>
<xml_diff>
--- a/Draft_Arah_Strategis_GloRI_QS_WUR.docx
+++ b/Draft_Arah_Strategis_GloRI_QS_WUR.docx
@@ -461,25 +461,7 @@
         <w:t xml:space="preserve"> </w:t>
       </w:r>
       <w:r>
-        <w:t xml:space="preserve">dokumen ini memakai nama</w:t>
-      </w:r>
-      <w:r>
-        <w:t xml:space="preserve"> </w:t>
-      </w:r>
-      <w:r>
-        <w:t xml:space="preserve">“</w:t>
-      </w:r>
-      <w:r>
-        <w:t xml:space="preserve">DMP</w:t>
-      </w:r>
-      <w:r>
-        <w:t xml:space="preserve">”</w:t>
-      </w:r>
-      <w:r>
-        <w:t xml:space="preserve"> </w:t>
-      </w:r>
-      <w:r>
-        <w:t xml:space="preserve">(Direktorat Manajemen Publikasi). Pencarian hanya menemukan Pusat Manajemen Publikasi (PMC) dengan fungsi pembinaan publikasi dan jurnal; apakah DMP adalah PMC yang sudah diubah namanya belum dapat dipastikan. [ISI: tugas dan fungsi DMP]</w:t>
+        <w:t xml:space="preserve">Direktorat Manajemen Publikasi, yang pada 2026 berubah status dari Pusat Manajemen Publikasi (PMC) menjadi direktorat (konfirmasi dari pimpinan GloRI). Fungsi PMC yang diketahui dari peraturan organisasi 2023 meliputi pembinaan publikasi dan jurnal internal serta pelatihan penulisan. Tugas dan fungsi DMP setelah menjadi direktorat belum diperoleh dan mungkin lebih luas. [ISI: tugas dan fungsi DMP terbaru]</w:t>
       </w:r>
     </w:p>
     <w:bookmarkEnd w:id="20"/>
@@ -665,7 +647,7 @@
         <w:t xml:space="preserve"> </w:t>
       </w:r>
       <w:r>
-        <w:t xml:space="preserve">dataset publikasi, audit afiliasi Scopus, dan pelatihan penulisan umum sebaiknya dimiliki DMP. GloRI memakai data itu dan memiliki klausul afiliasi di kontrak mitra, penandaan acknowledgment, serta engagement dengan akademisi. Program P3, P5, dan P12 berisiko tumpang tindih dengan DMP. [ISI: konfirmasi mandat DMP]</w:t>
+        <w:t xml:space="preserve">dataset publikasi, audit afiliasi Scopus, dan pelatihan penulisan umum sebaiknya dimiliki DMP. GloRI memakai data itu dan memiliki klausul afiliasi di kontrak mitra, penandaan acknowledgment, serta engagement dengan akademisi. Program P3, P5, dan P12 berisiko tumpang tindih dengan DMP. [ISI: tugas dan fungsi DMP terbaru]</w:t>
       </w:r>
     </w:p>
     <w:p>
@@ -11757,7 +11739,7 @@
         <w:pStyle w:val="FirstParagraph"/>
       </w:pPr>
       <w:r>
-        <w:t xml:space="preserve">Pembagian ini adalah usulan; mandat DMP belum dikonfirmasi. [ISI: tugas dan fungsi DMP] Prinsipnya: satu pemilik untuk setiap data, GloRI memakai data DMP dan tidak membangun yang sama.</w:t>
+        <w:t xml:space="preserve">Pembagian ini adalah usulan. DMP adalah PMC yang berubah menjadi direktorat pada 2026, dan fungsi PMC sebelumnya (pembinaan publikasi, jurnal internal, pelatihan penulisan) menjadi dasar anggapan di bawah. Tugas dan fungsi DMP yang terbaru belum diperoleh, sehingga pembagian perlu dicocokkan dengannya. [ISI: tugas dan fungsi DMP terbaru] Prinsipnya: satu pemilik untuk setiap data, GloRI memakai data DMP dan tidak membangun yang sama.</w:t>
       </w:r>
     </w:p>
     <w:tbl>
@@ -20075,7 +20057,7 @@
               <w:rPr>
                 <w:sz w:val="16"/>
               </w:rPr>
-              <w:t xml:space="preserve">Menetapkan pembagian peran GloRI dan DMP (5.5) dan mengonfirmasi mandat DMP</w:t>
+              <w:t xml:space="preserve">Menetapkan pembagian peran GloRI dan DMP (5.5) dengan mencocokkannya pada tugas dan fungsi DMP terbaru</w:t>
             </w:r>
           </w:p>
         </w:tc>
@@ -21753,7 +21735,7 @@
               <w:rPr>
                 <w:sz w:val="16"/>
               </w:rPr>
-              <w:t xml:space="preserve">Tugas dan fungsi DMP (dan PMC jika berbeda)</w:t>
+              <w:t xml:space="preserve">Tugas dan fungsi DMP terbaru (setelah perubahan dari PMC menjadi direktorat pada 2026)</w:t>
             </w:r>
           </w:p>
         </w:tc>

</xml_diff>

<commit_message>
Record official GloRI 2027 figures: 8 consortia, 20 joint publications, 3 fellows
Co-Authored-By: Claude Sonnet 5.5 <noreply@anthropic.com>
Claude-Session: https://claude.ai/code/session_01EyXn3PHR4UyVefB9g7RrZa
</commit_message>
<xml_diff>
--- a/Draft_Arah_Strategis_GloRI_QS_WUR.docx
+++ b/Draft_Arah_Strategis_GloRI_QS_WUR.docx
@@ -71,7 +71,7 @@
                 <w:b/>
                 <w:sz w:val="16"/>
               </w:rPr>
-              <w:t xml:space="preserve">DRAFT 0.3 untuk pembahasan dengan Direktur Eksekutif GloRI</w:t>
+              <w:t xml:space="preserve">DRAFT 0.4 untuk pembahasan dengan Direktur Eksekutif GloRI</w:t>
             </w:r>
             <w:r>
               <w:rPr>
@@ -242,22 +242,22 @@
               <w:rPr>
                 <w:sz w:val="16"/>
               </w:rPr>
-              <w:t xml:space="preserve">Perubahan dari 0.2</w:t>
-            </w:r>
-          </w:p>
-        </w:tc>
-        <w:tc>
-          <w:tcPr/>
-          <w:p>
-            <w:pPr>
-              <w:pStyle w:val="Compact"/>
-              <w:jc w:val="left"/>
-            </w:pPr>
-            <w:r>
-              <w:rPr>
-                <w:sz w:val="16"/>
-              </w:rPr>
-              <w:t xml:space="preserve">Seluruh angka anggaran dan kegiatan disesuaikan dengan cascading 2027 v2 (pagu Rp1 miliar); pemetaan program ke lima KPI dimasukkan (3.3); ketidakkonsistenan data diperbarui (3.5); distribusi anggaran ke KPI dan QS (4.4); temuan evaluasi diperbarui (6.4); opsi prioritisasi dengan pagu Rp1 miliar ditambahkan (6.7)</w:t>
+              <w:t xml:space="preserve">Perubahan dari 0.3</w:t>
+            </w:r>
+          </w:p>
+        </w:tc>
+        <w:tc>
+          <w:tcPr/>
+          <w:p>
+            <w:pPr>
+              <w:pStyle w:val="Compact"/>
+              <w:jc w:val="left"/>
+            </w:pPr>
+            <w:r>
+              <w:rPr>
+                <w:sz w:val="16"/>
+              </w:rPr>
+              <w:t xml:space="preserve">Angka resmi GloRI 2027 dimasukkan: 8 konsorsium, 20 joint publication, 3 fellow; konsekuensinya pada target, kegiatan, dan formula diperbarui (3.5, 6.1, 6.3, 6.4, 6.7)</w:t>
             </w:r>
           </w:p>
         </w:tc>
@@ -623,7 +623,7 @@
         <w:t xml:space="preserve"> </w:t>
       </w:r>
       <w:r>
-        <w:t xml:space="preserve">Target dana eksternal Rp60 miliar kini berarti leverage 60 kali (sebelumnya 20 kali). Anggaran fellow hanya cukup untuk sekitar 3 fellow, sementara kegiatan P4 masih menyebut 10 orang dan KPI Malino menyebut 20 sampai 30.</w:t>
+        <w:t xml:space="preserve">Target dana eksternal Rp60 miliar kini berarti leverage 60 kali (sebelumnya 20 kali). Angka resmi fellow adalah 3, sedangkan kegiatan P4 di file cascading masih menyebut 10 orang dan KPI Malino menyebut 20 sampai 30.</w:t>
       </w:r>
     </w:p>
     <w:p>
@@ -645,7 +645,7 @@
         <w:t xml:space="preserve"> </w:t>
       </w:r>
       <w:r>
-        <w:t xml:space="preserve">Kontribusi GloRI terhadap target universitas: 8 dari 40 konsorsium (20%) dan sekitar 12 sampai 20 dari 500 joint publication (2,5% sampai 4%; angkanya belum final). Sisanya bergantung pada fakultas.</w:t>
+        <w:t xml:space="preserve">Angka resmi kontribusi GloRI: 8 dari 40 konsorsium (20%) dan 20 dari 500 joint publication (4,0%). Dengan 3 fellow dan 8 konsorsium, formula cascading sebelumnya (satu joint publication per konsorsium dan per fellow) hanya menghasilkan 11; angka 20 menuntut sekitar 2 joint publication per konsorsium atau sumber di luar kedua kelompok itu.</w:t>
       </w:r>
     </w:p>
     <w:p>
@@ -7840,7 +7840,7 @@
               <w:rPr>
                 <w:sz w:val="16"/>
               </w:rPr>
-              <w:t xml:space="preserve">Seluruh kegiatan diperkecil; target rasional fellow menjadi 3,3</w:t>
+              <w:t xml:space="preserve">Seluruh kegiatan diperkecil; angka resmi fellow 3</w:t>
             </w:r>
           </w:p>
         </w:tc>
@@ -7902,7 +7902,7 @@
               <w:rPr>
                 <w:sz w:val="16"/>
               </w:rPr>
-              <w:t xml:space="preserve">Tetap satu kegiatan (4 coaching clinic); target rasional publikasi menjadi 12,3</w:t>
+              <w:t xml:space="preserve">Tetap satu kegiatan (4 coaching clinic); angka resmi joint publication 20</w:t>
             </w:r>
           </w:p>
         </w:tc>
@@ -8686,37 +8686,37 @@
               <w:rPr>
                 <w:sz w:val="16"/>
               </w:rPr>
-              <w:t xml:space="preserve">Kontribusi konsorsium GloRI: 8 (Raker 2-4 Oktober 2026, Summary) versus 9 (Dasar_Target dan target rasional P6)</w:t>
-            </w:r>
-          </w:p>
-        </w:tc>
-        <w:tc>
-          <w:tcPr/>
-          <w:p>
-            <w:pPr>
-              <w:pStyle w:val="Compact"/>
-              <w:jc w:val="left"/>
-            </w:pPr>
-            <w:r>
-              <w:rPr>
-                <w:sz w:val="16"/>
-              </w:rPr>
-              <w:t xml:space="preserve">Selisih satu konsorsium</w:t>
-            </w:r>
-          </w:p>
-        </w:tc>
-        <w:tc>
-          <w:tcPr/>
-          <w:p>
-            <w:pPr>
-              <w:pStyle w:val="Compact"/>
-              <w:jc w:val="left"/>
-            </w:pPr>
-            <w:r>
-              <w:rPr>
-                <w:sz w:val="16"/>
-              </w:rPr>
-              <w:t xml:space="preserve">[ISI: angka resmi dan daftar konsorsium]</w:t>
+              <w:t xml:space="preserve">Konsorsium: angka resmi 8; Dasar_Target dan target rasional P6 masih 9</w:t>
+            </w:r>
+          </w:p>
+        </w:tc>
+        <w:tc>
+          <w:tcPr/>
+          <w:p>
+            <w:pPr>
+              <w:pStyle w:val="Compact"/>
+              <w:jc w:val="left"/>
+            </w:pPr>
+            <w:r>
+              <w:rPr>
+                <w:sz w:val="16"/>
+              </w:rPr>
+              <w:t xml:space="preserve">Selisih satu konsorsium di file</w:t>
+            </w:r>
+          </w:p>
+        </w:tc>
+        <w:tc>
+          <w:tcPr/>
+          <w:p>
+            <w:pPr>
+              <w:pStyle w:val="Compact"/>
+              <w:jc w:val="left"/>
+            </w:pPr>
+            <w:r>
+              <w:rPr>
+                <w:sz w:val="16"/>
+              </w:rPr>
+              <w:t xml:space="preserve">Sesuaikan Dasar_Target dan P6 menjadi 8</w:t>
             </w:r>
           </w:p>
         </w:tc>
@@ -8748,37 +8748,37 @@
               <w:rPr>
                 <w:sz w:val="16"/>
               </w:rPr>
-              <w:t xml:space="preserve">Kontribusi joint publication GloRI: 12,3 (Dasar_Target), 18 sampai 20 (Raker), dan 40 paper disubmit (kegiatan P5); Summary menyatakan belum final</w:t>
-            </w:r>
-          </w:p>
-        </w:tc>
-        <w:tc>
-          <w:tcPr/>
-          <w:p>
-            <w:pPr>
-              <w:pStyle w:val="Compact"/>
-              <w:jc w:val="left"/>
-            </w:pPr>
-            <w:r>
-              <w:rPr>
-                <w:sz w:val="16"/>
-              </w:rPr>
-              <w:t xml:space="preserve">Tiga angka berbeda untuk satu indikator</w:t>
-            </w:r>
-          </w:p>
-        </w:tc>
-        <w:tc>
-          <w:tcPr/>
-          <w:p>
-            <w:pPr>
-              <w:pStyle w:val="Compact"/>
-              <w:jc w:val="left"/>
-            </w:pPr>
-            <w:r>
-              <w:rPr>
-                <w:sz w:val="16"/>
-              </w:rPr>
-              <w:t xml:space="preserve">[ISI: satu angka resmi dan definisi: submit atau terbit]</w:t>
+              <w:t xml:space="preserve">Joint publication: angka resmi 20; Dasar_Target menghitung 12,3 dan kegiatan P5 menargetkan 40 paper disubmit; definisi 20 (disubmit atau terbit) belum ditetapkan</w:t>
+            </w:r>
+          </w:p>
+        </w:tc>
+        <w:tc>
+          <w:tcPr/>
+          <w:p>
+            <w:pPr>
+              <w:pStyle w:val="Compact"/>
+              <w:jc w:val="left"/>
+            </w:pPr>
+            <w:r>
+              <w:rPr>
+                <w:sz w:val="16"/>
+              </w:rPr>
+              <w:t xml:space="preserve">Dengan 3 fellow dan 8 konsorsium, formula satu publikasi per unit hanya menghasilkan 11</w:t>
+            </w:r>
+          </w:p>
+        </w:tc>
+        <w:tc>
+          <w:tcPr/>
+          <w:p>
+            <w:pPr>
+              <w:pStyle w:val="Compact"/>
+              <w:jc w:val="left"/>
+            </w:pPr>
+            <w:r>
+              <w:rPr>
+                <w:sz w:val="16"/>
+              </w:rPr>
+              <w:t xml:space="preserve">Sesuaikan formula; [ISI: definisi 20]</w:t>
             </w:r>
           </w:p>
         </w:tc>
@@ -8810,7 +8810,7 @@
               <w:rPr>
                 <w:sz w:val="16"/>
               </w:rPr>
-              <w:t xml:space="preserve">Fellow: target rasional 3,3 (kapasitas anggaran), kegiatan P4 menyebut</w:t>
+              <w:t xml:space="preserve">Fellow: angka resmi 3; kegiatan P4 masih menyebut</w:t>
             </w:r>
             <w:r>
               <w:rPr>
@@ -8846,37 +8846,37 @@
               <w:rPr>
                 <w:sz w:val="16"/>
               </w:rPr>
-              <w:t xml:space="preserve">dengan Rp100 juta, KPI Malino 20 sampai 30</w:t>
-            </w:r>
-          </w:p>
-        </w:tc>
-        <w:tc>
-          <w:tcPr/>
-          <w:p>
-            <w:pPr>
-              <w:pStyle w:val="Compact"/>
-              <w:jc w:val="left"/>
-            </w:pPr>
-            <w:r>
-              <w:rPr>
-                <w:sz w:val="16"/>
-              </w:rPr>
-              <w:t xml:space="preserve">Anggaran Rp10 juta per orang tidak cukup untuk tiket, akomodasi, dan honor; kapasitas anggaran 0,17 dari minimum Malino</w:t>
-            </w:r>
-          </w:p>
-        </w:tc>
-        <w:tc>
-          <w:tcPr/>
-          <w:p>
-            <w:pPr>
-              <w:pStyle w:val="Compact"/>
-              <w:jc w:val="left"/>
-            </w:pPr>
-            <w:r>
-              <w:rPr>
-                <w:sz w:val="16"/>
-              </w:rPr>
-              <w:t xml:space="preserve">[ISI: jumlah fellow yang akan dibiayai]</w:t>
+              <w:t xml:space="preserve">dengan Rp100 juta; Dasar_Target 3,33; KPI Malino 20 sampai 30</w:t>
+            </w:r>
+          </w:p>
+        </w:tc>
+        <w:tc>
+          <w:tcPr/>
+          <w:p>
+            <w:pPr>
+              <w:pStyle w:val="Compact"/>
+              <w:jc w:val="left"/>
+            </w:pPr>
+            <w:r>
+              <w:rPr>
+                <w:sz w:val="16"/>
+              </w:rPr>
+              <w:t xml:space="preserve">Teks kegiatan tidak sesuai angka resmi; Rp150 juta untuk 3 fellow berarti sekitar Rp50 juta per fellow</w:t>
+            </w:r>
+          </w:p>
+        </w:tc>
+        <w:tc>
+          <w:tcPr/>
+          <w:p>
+            <w:pPr>
+              <w:pStyle w:val="Compact"/>
+              <w:jc w:val="left"/>
+            </w:pPr>
+            <w:r>
+              <w:rPr>
+                <w:sz w:val="16"/>
+              </w:rPr>
+              <w:t xml:space="preserve">Ubah kegiatan menjadi 3 fellow; [ISI: apakah KPI Malino 20 sampai 30 dicabut]</w:t>
             </w:r>
           </w:p>
         </w:tc>
@@ -8908,7 +8908,7 @@
               <w:rPr>
                 <w:sz w:val="16"/>
               </w:rPr>
-              <w:t xml:space="preserve">Target rasional berupa pecahan (3,3 fellow; 12,3 publikasi)</w:t>
+              <w:t xml:space="preserve">Target rasional pada file berupa pecahan (3,3 fellow; 12,3 publikasi)</w:t>
             </w:r>
           </w:p>
         </w:tc>
@@ -8938,7 +8938,7 @@
               <w:rPr>
                 <w:sz w:val="16"/>
               </w:rPr>
-              <w:t xml:space="preserve">Bulatkan dan sebutkan dasarnya</w:t>
+              <w:t xml:space="preserve">Gunakan angka resmi 3 dan 20</w:t>
             </w:r>
           </w:p>
         </w:tc>
@@ -16552,7 +16552,7 @@
               <w:rPr>
                 <w:sz w:val="16"/>
               </w:rPr>
-              <w:t xml:space="preserve">3,3 fellow (kegiatan menyebut 10)</w:t>
+              <w:t xml:space="preserve">3 fellow (angka resmi)</w:t>
             </w:r>
           </w:p>
         </w:tc>
@@ -16704,7 +16704,7 @@
               <w:rPr>
                 <w:sz w:val="16"/>
               </w:rPr>
-              <w:t xml:space="preserve">12,3 joint publication Q1/Q2 (belum final)</w:t>
+              <w:t xml:space="preserve">20 joint publication (angka resmi; definisi disubmit atau terbit [ISI])</w:t>
             </w:r>
           </w:p>
         </w:tc>
@@ -16856,7 +16856,7 @@
               <w:rPr>
                 <w:sz w:val="16"/>
               </w:rPr>
-              <w:t xml:space="preserve">9 konsorsium (8 menurut Raker)</w:t>
+              <w:t xml:space="preserve">8 konsorsium (angka resmi)</w:t>
             </w:r>
           </w:p>
         </w:tc>
@@ -19163,22 +19163,22 @@
               <w:rPr>
                 <w:sz w:val="16"/>
               </w:rPr>
-              <w:t xml:space="preserve">8 (Raker) atau 9 (Dasar_Target)</w:t>
-            </w:r>
-          </w:p>
-        </w:tc>
-        <w:tc>
-          <w:tcPr/>
-          <w:p>
-            <w:pPr>
-              <w:pStyle w:val="Compact"/>
-              <w:jc w:val="left"/>
-            </w:pPr>
-            <w:r>
-              <w:rPr>
-                <w:sz w:val="16"/>
-              </w:rPr>
-              <w:t xml:space="preserve">20,0% atau 22,5%</w:t>
+              <w:t xml:space="preserve">8 (angka resmi)</w:t>
+            </w:r>
+          </w:p>
+        </w:tc>
+        <w:tc>
+          <w:tcPr/>
+          <w:p>
+            <w:pPr>
+              <w:pStyle w:val="Compact"/>
+              <w:jc w:val="left"/>
+            </w:pPr>
+            <w:r>
+              <w:rPr>
+                <w:sz w:val="16"/>
+              </w:rPr>
+              <w:t xml:space="preserve">20,0%</w:t>
             </w:r>
           </w:p>
         </w:tc>
@@ -19240,37 +19240,37 @@
               <w:rPr>
                 <w:sz w:val="16"/>
               </w:rPr>
-              <w:t xml:space="preserve">12,3 (Dasar_Target), 18 sampai 20 (Raker), atau 40 disubmit (P5)</w:t>
-            </w:r>
-          </w:p>
-        </w:tc>
-        <w:tc>
-          <w:tcPr/>
-          <w:p>
-            <w:pPr>
-              <w:pStyle w:val="Compact"/>
-              <w:jc w:val="left"/>
-            </w:pPr>
-            <w:r>
-              <w:rPr>
-                <w:sz w:val="16"/>
-              </w:rPr>
-              <w:t xml:space="preserve">2,5%; 3,6% sampai 4,0%; 8,0%</w:t>
-            </w:r>
-          </w:p>
-        </w:tc>
-        <w:tc>
-          <w:tcPr/>
-          <w:p>
-            <w:pPr>
-              <w:pStyle w:val="Compact"/>
-              <w:jc w:val="left"/>
-            </w:pPr>
-            <w:r>
-              <w:rPr>
-                <w:sz w:val="16"/>
-              </w:rPr>
-              <w:t xml:space="preserve">Belum final; pilih satu angka dan definisi</w:t>
+              <w:t xml:space="preserve">20 (angka resmi)</w:t>
+            </w:r>
+          </w:p>
+        </w:tc>
+        <w:tc>
+          <w:tcPr/>
+          <w:p>
+            <w:pPr>
+              <w:pStyle w:val="Compact"/>
+              <w:jc w:val="left"/>
+            </w:pPr>
+            <w:r>
+              <w:rPr>
+                <w:sz w:val="16"/>
+              </w:rPr>
+              <w:t xml:space="preserve">4,0%</w:t>
+            </w:r>
+          </w:p>
+        </w:tc>
+        <w:tc>
+          <w:tcPr/>
+          <w:p>
+            <w:pPr>
+              <w:pStyle w:val="Compact"/>
+              <w:jc w:val="left"/>
+            </w:pPr>
+            <w:r>
+              <w:rPr>
+                <w:sz w:val="16"/>
+              </w:rPr>
+              <w:t xml:space="preserve">Definisi 20 (disubmit atau terbit) belum ditetapkan; kegiatan P5 menargetkan 40 paper disubmit</w:t>
             </w:r>
           </w:p>
         </w:tc>
@@ -19823,37 +19823,37 @@
               <w:rPr>
                 <w:sz w:val="16"/>
               </w:rPr>
-              <w:t xml:space="preserve">Anggaran Rp150 juta hanya membiayai sekitar 3 fellow, sedangkan kegiatan menyebut 10 orang dengan Rp100 juta (Rp10 juta per orang); KPI Malino 20 sampai 30. Output (fellow asing) berbeda dengan indikator 4.1.1 (persen dosen Unhas)</w:t>
-            </w:r>
-          </w:p>
-        </w:tc>
-        <w:tc>
-          <w:tcPr/>
-          <w:p>
-            <w:pPr>
-              <w:pStyle w:val="Compact"/>
-              <w:jc w:val="left"/>
-            </w:pPr>
-            <w:r>
-              <w:rPr>
-                <w:sz w:val="16"/>
-              </w:rPr>
-              <w:t xml:space="preserve">Memburuk</w:t>
-            </w:r>
-          </w:p>
-        </w:tc>
-        <w:tc>
-          <w:tcPr/>
-          <w:p>
-            <w:pPr>
-              <w:pStyle w:val="Compact"/>
-              <w:jc w:val="left"/>
-            </w:pPr>
-            <w:r>
-              <w:rPr>
-                <w:sz w:val="16"/>
-              </w:rPr>
-              <w:t xml:space="preserve">Pilih jumlah fellow yang realistis, pasangkan dengan dosen Unhas, dan hitung persen dosen yang terlibat; [ISI: keputusan]</w:t>
+              <w:t xml:space="preserve">Angka resmi 3 fellow sesuai kapasitas anggaran (Rp150 juta, sekitar Rp50 juta per fellow), tetapi kegiatan P4 masih menyebut 10 orang dengan Rp100 juta; KPI Malino 20 sampai 30. Output (fellow asing) berbeda dengan indikator 4.1.1 (persen dosen Unhas)</w:t>
+            </w:r>
+          </w:p>
+        </w:tc>
+        <w:tc>
+          <w:tcPr/>
+          <w:p>
+            <w:pPr>
+              <w:pStyle w:val="Compact"/>
+              <w:jc w:val="left"/>
+            </w:pPr>
+            <w:r>
+              <w:rPr>
+                <w:sz w:val="16"/>
+              </w:rPr>
+              <w:t xml:space="preserve">Sebagian: angka diputuskan, kegiatan belum disesuaikan</w:t>
+            </w:r>
+          </w:p>
+        </w:tc>
+        <w:tc>
+          <w:tcPr/>
+          <w:p>
+            <w:pPr>
+              <w:pStyle w:val="Compact"/>
+              <w:jc w:val="left"/>
+            </w:pPr>
+            <w:r>
+              <w:rPr>
+                <w:sz w:val="16"/>
+              </w:rPr>
+              <w:t xml:space="preserve">Ubah kegiatan menjadi 3 fellow, pasangkan dengan dosen Unhas, dan hitung persen dosen yang terlibat</w:t>
             </w:r>
           </w:p>
         </w:tc>
@@ -19900,37 +19900,37 @@
               <w:rPr>
                 <w:sz w:val="16"/>
               </w:rPr>
-              <w:t xml:space="preserve">Satu butir Rp83 juta untuk 4 coaching clinic dan 40 paper disubmit, tanpa rincian atau kriteria mutu; target rasional publikasi 12,3 berbeda dengan 18 sampai 20 (Raker)</w:t>
-            </w:r>
-          </w:p>
-        </w:tc>
-        <w:tc>
-          <w:tcPr/>
-          <w:p>
-            <w:pPr>
-              <w:pStyle w:val="Compact"/>
-              <w:jc w:val="left"/>
-            </w:pPr>
-            <w:r>
-              <w:rPr>
-                <w:sz w:val="16"/>
-              </w:rPr>
-              <w:t xml:space="preserve">Belum</w:t>
-            </w:r>
-          </w:p>
-        </w:tc>
-        <w:tc>
-          <w:tcPr/>
-          <w:p>
-            <w:pPr>
-              <w:pStyle w:val="Compact"/>
-              <w:jc w:val="left"/>
-            </w:pPr>
-            <w:r>
-              <w:rPr>
-                <w:sz w:val="16"/>
-              </w:rPr>
-              <w:t xml:space="preserve">Rinci per klinik, tetapkan kriteria jurnal sasaran, satukan angka (3.5, no 3); hubungkan dengan U1 dan U2; koordinasikan dengan pelatihan penulisan DMP</w:t>
+              <w:t xml:space="preserve">Satu butir Rp83 juta untuk 4 coaching clinic dan 40 paper disubmit, tanpa rincian atau kriteria mutu; angka resmi 20 joint publication belum punya definisi (disubmit atau terbit) dan tidak sesuai dengan formula Dasar_Target (3 fellow + 8 konsorsium x 1 = 11)</w:t>
+            </w:r>
+          </w:p>
+        </w:tc>
+        <w:tc>
+          <w:tcPr/>
+          <w:p>
+            <w:pPr>
+              <w:pStyle w:val="Compact"/>
+              <w:jc w:val="left"/>
+            </w:pPr>
+            <w:r>
+              <w:rPr>
+                <w:sz w:val="16"/>
+              </w:rPr>
+              <w:t xml:space="preserve">Sebagian: angka diputuskan, definisi dan formula belum</w:t>
+            </w:r>
+          </w:p>
+        </w:tc>
+        <w:tc>
+          <w:tcPr/>
+          <w:p>
+            <w:pPr>
+              <w:pStyle w:val="Compact"/>
+              <w:jc w:val="left"/>
+            </w:pPr>
+            <w:r>
+              <w:rPr>
+                <w:sz w:val="16"/>
+              </w:rPr>
+              <w:t xml:space="preserve">Tetapkan definisi 20; rinci per klinik dan kriteria mutu; sesuaikan formula (butuh sekitar 2 joint publication per konsorsium atau sumber lain); hubungkan dengan U1 dan U2; koordinasikan dengan DMP</w:t>
             </w:r>
           </w:p>
         </w:tc>
@@ -20131,37 +20131,37 @@
               <w:rPr>
                 <w:sz w:val="16"/>
               </w:rPr>
-              <w:t xml:space="preserve">Target 9 konsorsium versus 8 menurut Raker; sebagian pusat belum resmi (Sustainability Institute: MoU masih negosiasi); simposium Rp60 juta adalah 72% anggaran P6</w:t>
-            </w:r>
-          </w:p>
-        </w:tc>
-        <w:tc>
-          <w:tcPr/>
-          <w:p>
-            <w:pPr>
-              <w:pStyle w:val="Compact"/>
-              <w:jc w:val="left"/>
-            </w:pPr>
-            <w:r>
-              <w:rPr>
-                <w:sz w:val="16"/>
-              </w:rPr>
-              <w:t xml:space="preserve">Belum</w:t>
-            </w:r>
-          </w:p>
-        </w:tc>
-        <w:tc>
-          <w:tcPr/>
-          <w:p>
-            <w:pPr>
-              <w:pStyle w:val="Compact"/>
-              <w:jc w:val="left"/>
-            </w:pPr>
-            <w:r>
-              <w:rPr>
-                <w:sz w:val="16"/>
-              </w:rPr>
-              <w:t xml:space="preserve">[ISI: status tiap pusat dan konsorsium resmi]</w:t>
+              <w:t xml:space="preserve">Angka resmi 8 konsorsium (file masih 9); sebagian pusat belum resmi (Sustainability Institute: MoU masih negosiasi); simposium Rp60 juta adalah 72% anggaran P6</w:t>
+            </w:r>
+          </w:p>
+        </w:tc>
+        <w:tc>
+          <w:tcPr/>
+          <w:p>
+            <w:pPr>
+              <w:pStyle w:val="Compact"/>
+              <w:jc w:val="left"/>
+            </w:pPr>
+            <w:r>
+              <w:rPr>
+                <w:sz w:val="16"/>
+              </w:rPr>
+              <w:t xml:space="preserve">Sebagian</w:t>
+            </w:r>
+          </w:p>
+        </w:tc>
+        <w:tc>
+          <w:tcPr/>
+          <w:p>
+            <w:pPr>
+              <w:pStyle w:val="Compact"/>
+              <w:jc w:val="left"/>
+            </w:pPr>
+            <w:r>
+              <w:rPr>
+                <w:sz w:val="16"/>
+              </w:rPr>
+              <w:t xml:space="preserve">Sesuaikan file menjadi 8; [ISI: daftar 8 konsorsium dan status tiap pusat]</w:t>
             </w:r>
           </w:p>
         </w:tc>
@@ -23115,22 +23115,22 @@
               <w:rPr>
                 <w:sz w:val="16"/>
               </w:rPr>
-              <w:t xml:space="preserve">Hanya cukup sekitar 3 fellow; output tidak sama dengan indikator</w:t>
-            </w:r>
-          </w:p>
-        </w:tc>
-        <w:tc>
-          <w:tcPr/>
-          <w:p>
-            <w:pPr>
-              <w:pStyle w:val="Compact"/>
-              <w:jc w:val="left"/>
-            </w:pPr>
-            <w:r>
-              <w:rPr>
-                <w:sz w:val="16"/>
-              </w:rPr>
-              <w:t xml:space="preserve">Tetapkan jumlah realistis (3 sampai 4), pasangkan dengan dosen Unhas, atau gunakan fellowship daring</w:t>
+              <w:t xml:space="preserve">Angka resmi 3 fellow; kegiatan masih menyebut 10 orang; output tidak sama dengan indikator</w:t>
+            </w:r>
+          </w:p>
+        </w:tc>
+        <w:tc>
+          <w:tcPr/>
+          <w:p>
+            <w:pPr>
+              <w:pStyle w:val="Compact"/>
+              <w:jc w:val="left"/>
+            </w:pPr>
+            <w:r>
+              <w:rPr>
+                <w:sz w:val="16"/>
+              </w:rPr>
+              <w:t xml:space="preserve">Gunakan angka resmi 3 fellow, pasangkan dengan dosen Unhas, atau gunakan fellowship daring</w:t>
             </w:r>
           </w:p>
         </w:tc>
@@ -23825,7 +23825,7 @@
               <w:rPr>
                 <w:sz w:val="16"/>
               </w:rPr>
-              <w:t xml:space="preserve">4. Kontribusi langsung GloRI kecil terhadap target joint publication universitas (2,5% sampai 4%) dan belum final</w:t>
+              <w:t xml:space="preserve">4. Kontribusi langsung GloRI kecil terhadap target joint publication universitas (4,0%)</w:t>
             </w:r>
           </w:p>
         </w:tc>
@@ -24809,7 +24809,7 @@
               <w:rPr>
                 <w:sz w:val="16"/>
               </w:rPr>
-              <w:t xml:space="preserve">Mengonfirmasi pemetaan program ke KPI (3.3) dan memutuskan angka resmi joint publication, konsorsium, dan fellow (3.5)</w:t>
+              <w:t xml:space="preserve">Mengonfirmasi pemetaan program ke KPI (3.3), menyesuaikan file cascading dengan angka resmi (8 konsorsium, 20 joint publication, 3 fellow), dan menetapkan definisi joint publication (disubmit atau terbit)</w:t>
             </w:r>
           </w:p>
         </w:tc>
@@ -31123,6 +31123,14 @@
         </w:tc>
       </w:tr>
     </w:tbl>
+    <w:p>
+      <w:pPr>
+        <w:pStyle w:val="BodyText"/>
+      </w:pPr>
+      <w:r>
+        <w:t xml:space="preserve">Catatan: teks kegiatan pada tabel di atas mengikuti file v2 dan belum disesuaikan dengan angka resmi: P4 (10 orang menjadi 3), P5 (40 paper disubmit; angka resmi 20), P6 (target rasional 9 menjadi 8).</w:t>
+      </w:r>
+    </w:p>
     <w:bookmarkEnd w:id="64"/>
     <w:bookmarkStart w:id="65" w:name="X07ceb47edd132e5bd15433b5f1048caf8b60d21"/>
     <w:p>
@@ -31178,7 +31186,7 @@
         <w:pStyle w:val="Compact"/>
       </w:pPr>
       <w:r>
-        <w:t xml:space="preserve">Tahun target konsorsium; angka resmi konsorsium (8 atau 9), joint publication (12, 18 sampai 20, atau 40), dan fellow (3 atau 10); satuan; kode Renstra (Bagian 3.5).</w:t>
+        <w:t xml:space="preserve">Tahun target konsorsium (2.3.2); definisi joint publication 20 (disubmit atau terbit); penyesuaian file cascading dengan angka resmi 8, 20, dan 3; satuan; kode Renstra (Bagian 3.5).</w:t>
       </w:r>
     </w:p>
     <w:p>

</xml_diff>